<commit_message>
docs: regenerate reports with Chinese quotation marks
</commit_message>
<xml_diff>
--- a/Task1/Rebecca+Task1.docx
+++ b/Task1/Rebecca+Task1.docx
@@ -28,7 +28,7 @@
           <w:b w:val="0"/>
           <w:sz w:val="21"/>
         </w:rPr>
-        <w:t>量化交易是指利用计算机程序、数学模型和统计分析工具，自动化地执行交易策略的一种交易方式。随着大数据和人工智能技术的发展，量化交易已成为现代金融市场中不可或缺的组成部分。本报告是北京大学光华管理学院"量化交易：AI大模型辅助的金融交易策略"课程的第一项任务成果，围绕以下内容展开：（1）量化交易相较于传统手工操作的优势分析；（2）K线、基本面分析和技术分析三个核心概念的详细解释；（3）基于AKShare/Tushare Pro双数据源的Python编程实践，涵盖单股数据获取、多股跨行业对比、A股+港股跨市场K线分析，以及自包含交互式看板的构建。</w:t>
+        <w:t>量化交易是指利用计算机程序、数学模型和统计分析工具，自动化地执行交易策略的一种交易方式。随着大数据和人工智能技术的发展，量化交易已成为现代金融市场中不可或缺的组成部分。本报告是北京大学光华管理学院“量化交易：AI大模型辅助的金融交易策略”课程的第一项任务成果，围绕以下内容展开：（1）量化交易相较于传统手工操作的优势分析；（2）K线、基本面分析和技术分析三个核心概念的详细解释；（3）基于AKShare/Tushare Pro双数据源的Python编程实践，涵盖单股数据获取、多股跨行业对比、A股+港股跨市场K线分析，以及自包含交互式看板的构建。</w:t>
       </w:r>
     </w:p>
     <w:p>
@@ -1902,7 +1902,7 @@
           <w:b w:val="0"/>
           <w:sz w:val="21"/>
         </w:rPr>
-        <w:t>Tushare Pro（https://www.tushare.pro/）是国内知名的免费金融数据开放平台，提供股票、基金、期货、期权、指数、宏观经济等多类金融数据接口。注册步骤：访问官网→填写手机号/邮箱/密码完成注册→登录后在"个人主页→Token管理"复制API Token→在Python代码中通过ts.set_token()配置后即可调用。新注册用户拥有基础积分，可免费访问大部分常用行情数据接口。</w:t>
+        <w:t>Tushare Pro（https://www.tushare.pro/）是国内知名的免费金融数据开放平台，提供股票、基金、期货、期权、指数、宏观经济等多类金融数据接口。注册步骤：访问官网→填写手机号/邮箱/密码完成注册→登录后在“个人主页→Token管理”复制API Token→在Python代码中通过ts.set_token()配置后即可调用。新注册用户拥有基础积分，可免费访问大部分常用行情数据接口。</w:t>
       </w:r>
     </w:p>
     <w:p>
@@ -5732,7 +5732,7 @@
           <w:b w:val="0"/>
           <w:sz w:val="21"/>
         </w:rPr>
-        <w:t>（报告生成日期：2026年07月03日）</w:t>
+        <w:t>（报告生成日期：2026年07月09日）</w:t>
       </w:r>
     </w:p>
     <w:sectPr>

</xml_diff>